<commit_message>
final update of docx
</commit_message>
<xml_diff>
--- a/Technical_Overview.docx
+++ b/Technical_Overview.docx
@@ -138,16 +138,7 @@
           <w:rFonts w:ascii="Cambria" w:hAnsi="Cambria" w:cs="Times"/>
           <w:sz w:val="24"/>
         </w:rPr>
-        <w:t xml:space="preserve"> - applica</w:t>
-      </w:r>
-      <w:bookmarkStart w:id="0" w:name="_GoBack"/>
-      <w:bookmarkEnd w:id="0"/>
-      <w:r>
-        <w:rPr>
-          <w:rFonts w:ascii="Cambria" w:hAnsi="Cambria" w:cs="Times"/>
-          <w:sz w:val="24"/>
-        </w:rPr>
-        <w:t>tion entry point: heap setup, FreeRTOS hook functions, and creation of the two state machine tasks.</w:t>
+        <w:t xml:space="preserve"> - application entry point: heap setup, FreeRTOS hook functions, and creation of the two state machine tasks.</w:t>
       </w:r>
     </w:p>
     <w:p>
@@ -750,7 +741,25 @@
           <w:szCs w:val="28"/>
           <w:lang w:val="en-US"/>
         </w:rPr>
-        <w:t>Info level – Informing for transition between states</w:t>
+        <w:t xml:space="preserve">Info level – </w:t>
+      </w:r>
+      <w:r>
+        <w:rPr>
+          <w:rFonts w:ascii="Cambria" w:hAnsi="Cambria"/>
+          <w:sz w:val="28"/>
+          <w:szCs w:val="28"/>
+          <w:lang w:val="en-US"/>
+        </w:rPr>
+        <w:t>Informs</w:t>
+      </w:r>
+      <w:r>
+        <w:rPr>
+          <w:rFonts w:ascii="Cambria" w:hAnsi="Cambria"/>
+          <w:sz w:val="28"/>
+          <w:szCs w:val="28"/>
+          <w:lang w:val="en-US"/>
+        </w:rPr>
+        <w:t xml:space="preserve"> for transition between states</w:t>
       </w:r>
     </w:p>
     <w:p>
@@ -1203,7 +1212,17 @@
           <w:b/>
           <w:sz w:val="36"/>
         </w:rPr>
-        <w:t xml:space="preserve">5. </w:t>
+        <w:t>6</w:t>
+      </w:r>
+      <w:bookmarkStart w:id="0" w:name="_GoBack"/>
+      <w:bookmarkEnd w:id="0"/>
+      <w:r>
+        <w:rPr>
+          <w:rFonts w:ascii="Cambria" w:hAnsi="Cambria" w:cs="Times"/>
+          <w:b/>
+          <w:sz w:val="36"/>
+        </w:rPr>
+        <w:t xml:space="preserve">. </w:t>
       </w:r>
       <w:r>
         <w:rPr>
@@ -1369,9 +1388,9 @@
         <w:rPr>
           <w:rFonts w:ascii="Cambria" w:hAnsi="Cambria" w:cs="Times"/>
           <w:b/>
+          <w:noProof/>
           <w:sz w:val="24"/>
           <w:szCs w:val="24"/>
-          <w:lang w:val="en-US"/>
         </w:rPr>
         <w:drawing>
           <wp:inline distT="0" distB="0" distL="0" distR="0" wp14:anchorId="3700740D" wp14:editId="726C8789">
@@ -1526,9 +1545,9 @@
         <w:rPr>
           <w:rFonts w:ascii="Cambria" w:hAnsi="Cambria"/>
           <w:b/>
+          <w:noProof/>
           <w:sz w:val="24"/>
           <w:szCs w:val="24"/>
-          <w:lang w:val="en-US"/>
         </w:rPr>
         <w:lastRenderedPageBreak/>
         <w:drawing>
@@ -1622,9 +1641,9 @@
         <w:rPr>
           <w:rFonts w:ascii="Cambria" w:hAnsi="Cambria"/>
           <w:b/>
+          <w:noProof/>
           <w:sz w:val="24"/>
           <w:szCs w:val="24"/>
-          <w:lang w:val="en-US"/>
         </w:rPr>
         <w:drawing>
           <wp:inline distT="0" distB="0" distL="0" distR="0" wp14:anchorId="3FAA3266" wp14:editId="38E3CFC3">
@@ -1799,40 +1818,6 @@
           <w:lang w:val="en-US"/>
         </w:rPr>
         <w:t>Time in seconds for recovering from fault state</w:t>
-      </w:r>
-    </w:p>
-    <w:p>
-      <w:pPr>
-        <w:pStyle w:val="HTMLPreformatted"/>
-        <w:numPr>
-          <w:ilvl w:val="2"/>
-          <w:numId w:val="1"/>
-        </w:numPr>
-        <w:rPr>
-          <w:rFonts w:ascii="Cascadia Mono" w:hAnsi="Cascadia Mono"/>
-          <w:color w:val="000000"/>
-          <w:sz w:val="18"/>
-          <w:szCs w:val="18"/>
-        </w:rPr>
-      </w:pPr>
-      <w:r>
-        <w:rPr>
-          <w:rFonts w:ascii="Cascadia Mono" w:hAnsi="Cascadia Mono"/>
-          <w:color w:val="0000FF"/>
-          <w:sz w:val="18"/>
-          <w:szCs w:val="18"/>
-        </w:rPr>
-        <w:t>SLEEP_TRANSITIONS_TO_FAULT</w:t>
-      </w:r>
-      <w:r>
-        <w:rPr>
-          <w:rFonts w:ascii="Cascadia Mono" w:hAnsi="Cascadia Mono"/>
-          <w:color w:val="0000FF"/>
-          <w:sz w:val="18"/>
-          <w:szCs w:val="18"/>
-          <w:lang w:val="en-US"/>
-        </w:rPr>
-        <w:t xml:space="preserve"> – Logic guard for enabling state transition from Sleep directly to Fault state</w:t>
       </w:r>
     </w:p>
     <w:p>

</xml_diff>

<commit_message>
minor grammar and other fixes
</commit_message>
<xml_diff>
--- a/Technical_Overview.docx
+++ b/Technical_Overview.docx
@@ -138,7 +138,24 @@
           <w:rFonts w:ascii="Cambria" w:hAnsi="Cambria" w:cs="Times"/>
           <w:sz w:val="24"/>
         </w:rPr>
-        <w:t xml:space="preserve"> - application entry point: heap setup, FreeRTOS hook functions, and creation of the two state machine tasks.</w:t>
+        <w:t xml:space="preserve"> - application entry point</w:t>
+      </w:r>
+      <w:r>
+        <w:rPr>
+          <w:rFonts w:ascii="Cambria" w:hAnsi="Cambria" w:cs="Times"/>
+          <w:sz w:val="24"/>
+          <w:lang w:val="en-US"/>
+        </w:rPr>
+        <w:t xml:space="preserve"> - </w:t>
+      </w:r>
+      <w:bookmarkStart w:id="0" w:name="_GoBack"/>
+      <w:bookmarkEnd w:id="0"/>
+      <w:r>
+        <w:rPr>
+          <w:rFonts w:ascii="Cambria" w:hAnsi="Cambria" w:cs="Times"/>
+          <w:sz w:val="24"/>
+        </w:rPr>
+        <w:t>heap setup, FreeRTOS hook functions, and creation of the two state machine tasks.</w:t>
       </w:r>
     </w:p>
     <w:p>
@@ -238,6 +255,23 @@
           <w:rFonts w:ascii="Cambria" w:hAnsi="Cambria" w:cs="Times"/>
           <w:b/>
           <w:sz w:val="24"/>
+          <w:lang w:val="en-US"/>
+        </w:rPr>
+        <w:t>Sources /</w:t>
+      </w:r>
+      <w:r>
+        <w:rPr>
+          <w:rFonts w:ascii="Cambria" w:hAnsi="Cambria" w:cs="Times"/>
+          <w:sz w:val="24"/>
+          <w:lang w:val="en-US"/>
+        </w:rPr>
+        <w:t xml:space="preserve"> </w:t>
+      </w:r>
+      <w:r>
+        <w:rPr>
+          <w:rFonts w:ascii="Cambria" w:hAnsi="Cambria" w:cs="Times"/>
+          <w:b/>
+          <w:sz w:val="24"/>
         </w:rPr>
         <w:t>StateMachine_DevB_Cfg.h</w:t>
       </w:r>
@@ -684,7 +718,15 @@
           <w:rFonts w:ascii="Cambria" w:hAnsi="Cambria" w:cs="Times"/>
           <w:sz w:val="24"/>
         </w:rPr>
-        <w:t xml:space="preserve"> and reacts to it: it moves to PROCESSING when B is ACTIVE, moves to ERROR when B is FAULT, and can issue a reset to Device B once a fault has been confirmed for a sustained period.</w:t>
+        <w:t xml:space="preserve"> and reacts to it: it moves to </w:t>
+      </w:r>
+      <w:r>
+        <w:rPr>
+          <w:rFonts w:ascii="Cambria" w:hAnsi="Cambria" w:cs="Times"/>
+          <w:sz w:val="24"/>
+        </w:rPr>
+        <w:lastRenderedPageBreak/>
+        <w:t>PROCESSING when B is ACTIVE, moves to ERROR when B is FAULT, and can issue a reset to Device B once a fault has been confirmed for a sustained period.</w:t>
       </w:r>
     </w:p>
     <w:p>
@@ -702,17 +744,27 @@
         <w:rPr>
           <w:rFonts w:ascii="Cambria" w:hAnsi="Cambria" w:cs="Times"/>
           <w:b/>
-          <w:sz w:val="32"/>
-          <w:szCs w:val="32"/>
-          <w:lang w:val="en-US"/>
-        </w:rPr>
-      </w:pPr>
-      <w:r>
-        <w:rPr>
-          <w:rFonts w:ascii="Cambria" w:hAnsi="Cambria" w:cs="Times"/>
-          <w:b/>
-          <w:sz w:val="32"/>
-          <w:szCs w:val="32"/>
+          <w:sz w:val="36"/>
+          <w:szCs w:val="36"/>
+          <w:lang w:val="en-US"/>
+        </w:rPr>
+      </w:pPr>
+      <w:r>
+        <w:rPr>
+          <w:rFonts w:ascii="Cambria" w:hAnsi="Cambria" w:cs="Times"/>
+          <w:b/>
+          <w:sz w:val="36"/>
+          <w:szCs w:val="36"/>
+          <w:lang w:val="en-US"/>
+        </w:rPr>
+        <w:t xml:space="preserve">3. </w:t>
+      </w:r>
+      <w:r>
+        <w:rPr>
+          <w:rFonts w:ascii="Cambria" w:hAnsi="Cambria" w:cs="Times"/>
+          <w:b/>
+          <w:sz w:val="36"/>
+          <w:szCs w:val="36"/>
           <w:lang w:val="en-US"/>
         </w:rPr>
         <w:t>Logger level indicators:</w:t>
@@ -827,7 +879,15 @@
           <w:b/>
           <w:sz w:val="36"/>
         </w:rPr>
-        <w:t>3. Protection of Shared Data</w:t>
+        <w:t>4</w:t>
+      </w:r>
+      <w:r>
+        <w:rPr>
+          <w:rFonts w:ascii="Cambria" w:hAnsi="Cambria" w:cs="Times"/>
+          <w:b/>
+          <w:sz w:val="36"/>
+        </w:rPr>
+        <w:t>. Protection of Shared Data</w:t>
       </w:r>
     </w:p>
     <w:p>
@@ -859,7 +919,15 @@
           <w:b/>
           <w:sz w:val="36"/>
         </w:rPr>
-        <w:t>4. FreeRTOS Version and Environment</w:t>
+        <w:t>5</w:t>
+      </w:r>
+      <w:r>
+        <w:rPr>
+          <w:rFonts w:ascii="Cambria" w:hAnsi="Cambria" w:cs="Times"/>
+          <w:b/>
+          <w:sz w:val="36"/>
+        </w:rPr>
+        <w:t>. FreeRTOS Version and Environment</w:t>
       </w:r>
     </w:p>
     <w:p>
@@ -868,6 +936,7 @@
         <w:rPr>
           <w:rFonts w:ascii="Cambria" w:hAnsi="Cambria" w:cs="Times"/>
           <w:sz w:val="24"/>
+          <w:lang w:val="en-US"/>
         </w:rPr>
       </w:pPr>
       <w:r>
@@ -910,6 +979,14 @@
         </w:rPr>
         <w:t xml:space="preserve"> in this package as plain files</w:t>
       </w:r>
+      <w:r>
+        <w:rPr>
+          <w:rFonts w:ascii="Cambria" w:hAnsi="Cambria" w:cs="Times"/>
+          <w:sz w:val="24"/>
+          <w:lang w:val="en-US"/>
+        </w:rPr>
+        <w:t xml:space="preserve"> – latest and greatest from the github repo</w:t>
+      </w:r>
     </w:p>
     <w:p>
       <w:pPr>
@@ -969,7 +1046,15 @@
           <w:b/>
           <w:sz w:val="36"/>
         </w:rPr>
-        <w:t>5. Compiling and Running</w:t>
+        <w:t>6</w:t>
+      </w:r>
+      <w:r>
+        <w:rPr>
+          <w:rFonts w:ascii="Cambria" w:hAnsi="Cambria" w:cs="Times"/>
+          <w:b/>
+          <w:sz w:val="36"/>
+        </w:rPr>
+        <w:t>. Compiling and Running</w:t>
       </w:r>
     </w:p>
     <w:p>
@@ -1079,7 +1164,14 @@
           <w:sz w:val="24"/>
         </w:rPr>
         <w:tab/>
-        <w:t>4</w:t>
+      </w:r>
+      <w:r>
+        <w:rPr>
+          <w:rFonts w:ascii="Cambria" w:hAnsi="Cambria" w:cs="Times"/>
+          <w:sz w:val="24"/>
+          <w:lang w:val="en-US"/>
+        </w:rPr>
+        <w:t>3</w:t>
       </w:r>
       <w:r>
         <w:rPr>
@@ -1105,7 +1197,7 @@
           <w:sz w:val="24"/>
         </w:rPr>
         <w:tab/>
-        <w:t>5</w:t>
+        <w:t>4</w:t>
       </w:r>
       <w:r>
         <w:rPr>
@@ -1211,11 +1303,10 @@
           <w:rFonts w:ascii="Cambria" w:hAnsi="Cambria" w:cs="Times"/>
           <w:b/>
           <w:sz w:val="36"/>
-        </w:rPr>
-        <w:t>6</w:t>
-      </w:r>
-      <w:bookmarkStart w:id="0" w:name="_GoBack"/>
-      <w:bookmarkEnd w:id="0"/>
+          <w:lang w:val="en-US"/>
+        </w:rPr>
+        <w:t>7</w:t>
+      </w:r>
       <w:r>
         <w:rPr>
           <w:rFonts w:ascii="Cambria" w:hAnsi="Cambria" w:cs="Times"/>

</xml_diff>